<commit_message>
Manuals: the Journeys chapter and the set-up guide follow PR 109
- User Guide, Journeys: Save as Template and Your Templates (saving, previewing, using, deleting), the Sender field on message
  steps, the Customers card's Held Back Reason filter and its export, the link from a timeline to the customer page, the
  Journeys dataset in Reports; the note that templates are not offered is gone
- The Word set-up guide's chapter 12.1 now lists the app gaps as closed, with what each became, and the suggested order
  names what is left (a dark-theme pass, a platform catalogue of shared starters)

Co-Authored-By: Claude Fable 5.1 <noreply@anthropic.com>
</commit_message>
<xml_diff>
--- a/docs/guides/CEP_Journeys_Setup_Guide.docx
+++ b/docs/guides/CEP_Journeys_Setup_Guide.docx
@@ -54,7 +54,7 @@
           <w:sz w:val="20"/>
           <w:szCs w:val="20"/>
         </w:rPr>
-        <w:t xml:space="preserve">Built 2026-10-08 from the CEP code and manuals at main (PRs #98 to #106, database patches 0045 and 0046). Screenshots are from the app's design playgrounds with sample data.</w:t>
+        <w:t xml:space="preserve">Built 2026-10-09 from the CEP code and manuals at main (PRs #98 to #106, database patches 0045 and 0046). Screenshots are from the app's design playgrounds with sample data.</w:t>
       </w:r>
     </w:p>
     <w:p>
@@ -16677,7 +16677,7 @@
         <w:rPr>
           <w:rFonts w:ascii="Calibri" w:cs="Calibri" w:eastAsia="Calibri" w:hAnsi="Calibri"/>
         </w:rPr>
-        <w:t xml:space="preserve">The engine, the builder and the measurement are complete and deployed (PRs #98 to #106). What remains is partly in the app and mostly in the systems around it. Each item says what is missing, what it blocks, and what fills it.</w:t>
+        <w:t xml:space="preserve">The engine, the builder, the measurement and the app-side gaps below are complete and deployed (PRs #98 to #109). What remains is in the systems around the app. Each item says what is missing, what it blocks, and what fills it.</w:t>
       </w:r>
     </w:p>
     <w:p>
@@ -16688,7 +16688,582 @@
         <w:rPr>
           <w:rFonts w:ascii="Calibri" w:cs="Calibri" w:eastAsia="Calibri" w:hAnsi="Calibri"/>
         </w:rPr>
-        <w:t xml:space="preserve">12.1 Gaps in the App</w:t>
+        <w:t xml:space="preserve">12.1 Gaps in the App, Now Closed</w:t>
+      </w:r>
+    </w:p>
+    <w:p>
+      <w:pPr>
+        <w:spacing w:after="120" w:line="276"/>
+      </w:pPr>
+      <w:r>
+        <w:rPr>
+          <w:rFonts w:ascii="Calibri" w:cs="Calibri" w:eastAsia="Calibri" w:hAnsi="Calibri"/>
+        </w:rPr>
+        <w:t xml:space="preserve">The app-side gaps found while writing this guide were built and deployed in PR #109 on 8 October 2026. They are kept here so a reader of an earlier copy knows what changed.</w:t>
+      </w:r>
+    </w:p>
+    <w:tbl>
+      <w:tblPr>
+        <w:tblW w:type="dxa" w:w="9360"/>
+        <w:tblBorders>
+          <w:top w:val="single" w:color="auto" w:sz="4"/>
+          <w:left w:val="single" w:color="auto" w:sz="4"/>
+          <w:bottom w:val="single" w:color="auto" w:sz="4"/>
+          <w:right w:val="single" w:color="auto" w:sz="4"/>
+          <w:insideH w:val="single" w:color="auto" w:sz="4"/>
+          <w:insideV w:val="single" w:color="auto" w:sz="4"/>
+        </w:tblBorders>
+      </w:tblPr>
+      <w:tblGrid>
+        <w:gridCol w:w="2340"/>
+        <w:gridCol w:w="7020"/>
+      </w:tblGrid>
+      <w:tr>
+        <w:trPr>
+          <w:tblHeader/>
+        </w:trPr>
+        <w:tc>
+          <w:tcPr>
+            <w:tcW w:type="dxa" w:w="2340"/>
+            <w:tcBorders>
+              <w:top w:val="single" w:color="C9CDD8" w:sz="4"/>
+              <w:left w:val="single" w:color="C9CDD8" w:sz="4"/>
+              <w:bottom w:val="single" w:color="C9CDD8" w:sz="4"/>
+              <w:right w:val="single" w:color="C9CDD8" w:sz="4"/>
+            </w:tcBorders>
+            <w:shd w:fill="EEF1F8" w:color="auto" w:val="clear"/>
+            <w:tcMar>
+              <w:top w:type="dxa" w:w="60"/>
+              <w:left w:type="dxa" w:w="100"/>
+              <w:bottom w:type="dxa" w:w="60"/>
+              <w:right w:type="dxa" w:w="100"/>
+            </w:tcMar>
+          </w:tcPr>
+          <w:p>
+            <w:pPr>
+              <w:spacing w:after="0"/>
+            </w:pPr>
+            <w:r>
+              <w:rPr>
+                <w:rFonts w:ascii="Calibri" w:cs="Calibri" w:eastAsia="Calibri" w:hAnsi="Calibri"/>
+                <w:b/>
+                <w:bCs/>
+                <w:sz w:val="19"/>
+                <w:szCs w:val="19"/>
+              </w:rPr>
+              <w:t xml:space="preserve">Was</w:t>
+            </w:r>
+          </w:p>
+        </w:tc>
+        <w:tc>
+          <w:tcPr>
+            <w:tcW w:type="dxa" w:w="7020"/>
+            <w:tcBorders>
+              <w:top w:val="single" w:color="C9CDD8" w:sz="4"/>
+              <w:left w:val="single" w:color="C9CDD8" w:sz="4"/>
+              <w:bottom w:val="single" w:color="C9CDD8" w:sz="4"/>
+              <w:right w:val="single" w:color="C9CDD8" w:sz="4"/>
+            </w:tcBorders>
+            <w:shd w:fill="EEF1F8" w:color="auto" w:val="clear"/>
+            <w:tcMar>
+              <w:top w:type="dxa" w:w="60"/>
+              <w:left w:type="dxa" w:w="100"/>
+              <w:bottom w:type="dxa" w:w="60"/>
+              <w:right w:type="dxa" w:w="100"/>
+            </w:tcMar>
+          </w:tcPr>
+          <w:p>
+            <w:pPr>
+              <w:spacing w:after="0"/>
+            </w:pPr>
+            <w:r>
+              <w:rPr>
+                <w:rFonts w:ascii="Calibri" w:cs="Calibri" w:eastAsia="Calibri" w:hAnsi="Calibri"/>
+                <w:b/>
+                <w:bCs/>
+                <w:sz w:val="19"/>
+                <w:szCs w:val="19"/>
+              </w:rPr>
+              <w:t xml:space="preserve">Now</w:t>
+            </w:r>
+          </w:p>
+        </w:tc>
+      </w:tr>
+      <w:tr>
+        <w:tc>
+          <w:tcPr>
+            <w:tcW w:type="dxa" w:w="2340"/>
+            <w:tcBorders>
+              <w:top w:val="single" w:color="C9CDD8" w:sz="4"/>
+              <w:left w:val="single" w:color="C9CDD8" w:sz="4"/>
+              <w:bottom w:val="single" w:color="C9CDD8" w:sz="4"/>
+              <w:right w:val="single" w:color="C9CDD8" w:sz="4"/>
+            </w:tcBorders>
+            <w:tcMar>
+              <w:top w:type="dxa" w:w="60"/>
+              <w:left w:type="dxa" w:w="100"/>
+              <w:bottom w:type="dxa" w:w="60"/>
+              <w:right w:type="dxa" w:w="100"/>
+            </w:tcMar>
+          </w:tcPr>
+          <w:p>
+            <w:pPr>
+              <w:spacing w:after="0"/>
+            </w:pPr>
+            <w:r>
+              <w:rPr>
+                <w:rFonts w:ascii="Calibri" w:cs="Calibri" w:eastAsia="Calibri" w:hAnsi="Calibri"/>
+                <w:sz w:val="19"/>
+                <w:szCs w:val="19"/>
+              </w:rPr>
+              <w:t xml:space="preserve">No customer record page</w:t>
+            </w:r>
+          </w:p>
+        </w:tc>
+        <w:tc>
+          <w:tcPr>
+            <w:tcW w:type="dxa" w:w="7020"/>
+            <w:tcBorders>
+              <w:top w:val="single" w:color="C9CDD8" w:sz="4"/>
+              <w:left w:val="single" w:color="C9CDD8" w:sz="4"/>
+              <w:bottom w:val="single" w:color="C9CDD8" w:sz="4"/>
+              <w:right w:val="single" w:color="C9CDD8" w:sz="4"/>
+            </w:tcBorders>
+            <w:tcMar>
+              <w:top w:type="dxa" w:w="60"/>
+              <w:left w:type="dxa" w:w="100"/>
+              <w:bottom w:type="dxa" w:w="60"/>
+              <w:right w:type="dxa" w:w="100"/>
+            </w:tcMar>
+          </w:tcPr>
+          <w:p>
+            <w:pPr>
+              <w:spacing w:after="0"/>
+            </w:pPr>
+            <w:r>
+              <w:rPr>
+                <w:rFonts w:ascii="Calibri" w:cs="Calibri" w:eastAsia="Calibri" w:hAnsi="Calibri"/>
+                <w:sz w:val="19"/>
+                <w:szCs w:val="19"/>
+              </w:rPr>
+              <w:t xml:space="preserve">Contact Lists → </w:t>
+            </w:r>
+            <w:r>
+              <w:rPr>
+                <w:rFonts w:ascii="Calibri" w:cs="Calibri" w:eastAsia="Calibri" w:hAnsi="Calibri"/>
+                <w:sz w:val="19"/>
+                <w:szCs w:val="19"/>
+              </w:rPr>
+              <w:t xml:space="preserve">Find a Customer</w:t>
+            </w:r>
+            <w:r>
+              <w:rPr>
+                <w:rFonts w:ascii="Calibri" w:cs="Calibri" w:eastAsia="Calibri" w:hAnsi="Calibri"/>
+                <w:sz w:val="19"/>
+                <w:szCs w:val="19"/>
+              </w:rPr>
+              <w:t xml:space="preserve"> searches by name, email, mobile or id. A customer's page shows the record, consent per channel, custom attributes, every journey entered with a link to the timeline, events, orders, messages and lists. A journey's timeline drawer, a list's members and Settings → Events link to it.</w:t>
+            </w:r>
+          </w:p>
+        </w:tc>
+      </w:tr>
+      <w:tr>
+        <w:tc>
+          <w:tcPr>
+            <w:tcW w:type="dxa" w:w="2340"/>
+            <w:tcBorders>
+              <w:top w:val="single" w:color="C9CDD8" w:sz="4"/>
+              <w:left w:val="single" w:color="C9CDD8" w:sz="4"/>
+              <w:bottom w:val="single" w:color="C9CDD8" w:sz="4"/>
+              <w:right w:val="single" w:color="C9CDD8" w:sz="4"/>
+            </w:tcBorders>
+            <w:tcMar>
+              <w:top w:type="dxa" w:w="60"/>
+              <w:left w:type="dxa" w:w="100"/>
+              <w:bottom w:type="dxa" w:w="60"/>
+              <w:right w:type="dxa" w:w="100"/>
+            </w:tcMar>
+          </w:tcPr>
+          <w:p>
+            <w:pPr>
+              <w:spacing w:after="0"/>
+            </w:pPr>
+            <w:r>
+              <w:rPr>
+                <w:rFonts w:ascii="Calibri" w:cs="Calibri" w:eastAsia="Calibri" w:hAnsi="Calibri"/>
+                <w:sz w:val="19"/>
+                <w:szCs w:val="19"/>
+              </w:rPr>
+              <w:t xml:space="preserve">No report engine and no Journeys dataset</w:t>
+            </w:r>
+          </w:p>
+        </w:tc>
+        <w:tc>
+          <w:tcPr>
+            <w:tcW w:type="dxa" w:w="7020"/>
+            <w:tcBorders>
+              <w:top w:val="single" w:color="C9CDD8" w:sz="4"/>
+              <w:left w:val="single" w:color="C9CDD8" w:sz="4"/>
+              <w:bottom w:val="single" w:color="C9CDD8" w:sz="4"/>
+              <w:right w:val="single" w:color="C9CDD8" w:sz="4"/>
+            </w:tcBorders>
+            <w:tcMar>
+              <w:top w:type="dxa" w:w="60"/>
+              <w:left w:type="dxa" w:w="100"/>
+              <w:bottom w:type="dxa" w:w="60"/>
+              <w:right w:type="dxa" w:w="100"/>
+            </w:tcMar>
+          </w:tcPr>
+          <w:p>
+            <w:pPr>
+              <w:spacing w:after="0"/>
+            </w:pPr>
+            <w:r>
+              <w:rPr>
+                <w:rFonts w:ascii="Calibri" w:cs="Calibri" w:eastAsia="Calibri" w:hAnsi="Calibri"/>
+                <w:sz w:val="19"/>
+                <w:szCs w:val="19"/>
+              </w:rPr>
+              <w:t xml:space="preserve">Reports has a </w:t>
+            </w:r>
+            <w:r>
+              <w:rPr>
+                <w:rFonts w:ascii="Calibri" w:cs="Calibri" w:eastAsia="Calibri" w:hAnsi="Calibri"/>
+                <w:sz w:val="19"/>
+                <w:szCs w:val="19"/>
+              </w:rPr>
+              <w:t xml:space="preserve">Dataset</w:t>
+            </w:r>
+            <w:r>
+              <w:rPr>
+                <w:rFonts w:ascii="Calibri" w:cs="Calibri" w:eastAsia="Calibri" w:hAnsi="Calibri"/>
+                <w:sz w:val="19"/>
+                <w:szCs w:val="19"/>
+              </w:rPr>
+              <w:t xml:space="preserve"> switch. The Journeys dataset is per journey per day: entered, converted with revenue, sent, delivered, opened, clicked, held back, failed; tiles, the day curve, a row per journey, a journey filter and a CSV of every journey's every day.</w:t>
+            </w:r>
+          </w:p>
+        </w:tc>
+      </w:tr>
+      <w:tr>
+        <w:tc>
+          <w:tcPr>
+            <w:tcW w:type="dxa" w:w="2340"/>
+            <w:tcBorders>
+              <w:top w:val="single" w:color="C9CDD8" w:sz="4"/>
+              <w:left w:val="single" w:color="C9CDD8" w:sz="4"/>
+              <w:bottom w:val="single" w:color="C9CDD8" w:sz="4"/>
+              <w:right w:val="single" w:color="C9CDD8" w:sz="4"/>
+            </w:tcBorders>
+            <w:tcMar>
+              <w:top w:type="dxa" w:w="60"/>
+              <w:left w:type="dxa" w:w="100"/>
+              <w:bottom w:type="dxa" w:w="60"/>
+              <w:right w:type="dxa" w:w="100"/>
+            </w:tcMar>
+          </w:tcPr>
+          <w:p>
+            <w:pPr>
+              <w:spacing w:after="0"/>
+            </w:pPr>
+            <w:r>
+              <w:rPr>
+                <w:rFonts w:ascii="Calibri" w:cs="Calibri" w:eastAsia="Calibri" w:hAnsi="Calibri"/>
+                <w:sz w:val="19"/>
+                <w:szCs w:val="19"/>
+              </w:rPr>
+              <w:t xml:space="preserve">No save-as-template</w:t>
+            </w:r>
+          </w:p>
+        </w:tc>
+        <w:tc>
+          <w:tcPr>
+            <w:tcW w:type="dxa" w:w="7020"/>
+            <w:tcBorders>
+              <w:top w:val="single" w:color="C9CDD8" w:sz="4"/>
+              <w:left w:val="single" w:color="C9CDD8" w:sz="4"/>
+              <w:bottom w:val="single" w:color="C9CDD8" w:sz="4"/>
+              <w:right w:val="single" w:color="C9CDD8" w:sz="4"/>
+            </w:tcBorders>
+            <w:tcMar>
+              <w:top w:type="dxa" w:w="60"/>
+              <w:left w:type="dxa" w:w="100"/>
+              <w:bottom w:type="dxa" w:w="60"/>
+              <w:right w:type="dxa" w:w="100"/>
+            </w:tcMar>
+          </w:tcPr>
+          <w:p>
+            <w:pPr>
+              <w:spacing w:after="0"/>
+            </w:pPr>
+            <w:r>
+              <w:rPr>
+                <w:rFonts w:ascii="Calibri" w:cs="Calibri" w:eastAsia="Calibri" w:hAnsi="Calibri"/>
+                <w:sz w:val="19"/>
+                <w:szCs w:val="19"/>
+              </w:rPr>
+              <w:t xml:space="preserve">Save as Template</w:t>
+            </w:r>
+            <w:r>
+              <w:rPr>
+                <w:rFonts w:ascii="Calibri" w:cs="Calibri" w:eastAsia="Calibri" w:hAnsi="Calibri"/>
+                <w:sz w:val="19"/>
+                <w:szCs w:val="19"/>
+              </w:rPr>
+              <w:t xml:space="preserve"> on a journey's page keeps the live version as a template of the workspace; </w:t>
+            </w:r>
+            <w:r>
+              <w:rPr>
+                <w:rFonts w:ascii="Calibri" w:cs="Calibri" w:eastAsia="Calibri" w:hAnsi="Calibri"/>
+                <w:sz w:val="19"/>
+                <w:szCs w:val="19"/>
+              </w:rPr>
+              <w:t xml:space="preserve">Your Templates</w:t>
+            </w:r>
+            <w:r>
+              <w:rPr>
+                <w:rFonts w:ascii="Calibri" w:cs="Calibri" w:eastAsia="Calibri" w:hAnsi="Calibri"/>
+                <w:sz w:val="19"/>
+                <w:szCs w:val="19"/>
+              </w:rPr>
+              <w:t xml:space="preserve"> on the Journey Templates panel and in the gallery previews, copies and deletes them. A platform catalogue of shared starters is still not offered: CEP's starters stay in code.</w:t>
+            </w:r>
+          </w:p>
+        </w:tc>
+      </w:tr>
+      <w:tr>
+        <w:tc>
+          <w:tcPr>
+            <w:tcW w:type="dxa" w:w="2340"/>
+            <w:tcBorders>
+              <w:top w:val="single" w:color="C9CDD8" w:sz="4"/>
+              <w:left w:val="single" w:color="C9CDD8" w:sz="4"/>
+              <w:bottom w:val="single" w:color="C9CDD8" w:sz="4"/>
+              <w:right w:val="single" w:color="C9CDD8" w:sz="4"/>
+            </w:tcBorders>
+            <w:tcMar>
+              <w:top w:type="dxa" w:w="60"/>
+              <w:left w:type="dxa" w:w="100"/>
+              <w:bottom w:type="dxa" w:w="60"/>
+              <w:right w:type="dxa" w:w="100"/>
+            </w:tcMar>
+          </w:tcPr>
+          <w:p>
+            <w:pPr>
+              <w:spacing w:after="0"/>
+            </w:pPr>
+            <w:r>
+              <w:rPr>
+                <w:rFonts w:ascii="Calibri" w:cs="Calibri" w:eastAsia="Calibri" w:hAnsi="Calibri"/>
+                <w:sz w:val="19"/>
+                <w:szCs w:val="19"/>
+              </w:rPr>
+              <w:t xml:space="preserve">Message steps have no sender choice</w:t>
+            </w:r>
+          </w:p>
+        </w:tc>
+        <w:tc>
+          <w:tcPr>
+            <w:tcW w:type="dxa" w:w="7020"/>
+            <w:tcBorders>
+              <w:top w:val="single" w:color="C9CDD8" w:sz="4"/>
+              <w:left w:val="single" w:color="C9CDD8" w:sz="4"/>
+              <w:bottom w:val="single" w:color="C9CDD8" w:sz="4"/>
+              <w:right w:val="single" w:color="C9CDD8" w:sz="4"/>
+            </w:tcBorders>
+            <w:tcMar>
+              <w:top w:type="dxa" w:w="60"/>
+              <w:left w:type="dxa" w:w="100"/>
+              <w:bottom w:type="dxa" w:w="60"/>
+              <w:right w:type="dxa" w:w="100"/>
+            </w:tcMar>
+          </w:tcPr>
+          <w:p>
+            <w:pPr>
+              <w:spacing w:after="0"/>
+            </w:pPr>
+            <w:r>
+              <w:rPr>
+                <w:rFonts w:ascii="Calibri" w:cs="Calibri" w:eastAsia="Calibri" w:hAnsi="Calibri"/>
+                <w:sz w:val="19"/>
+                <w:szCs w:val="19"/>
+              </w:rPr>
+              <w:t xml:space="preserve">A </w:t>
+            </w:r>
+            <w:r>
+              <w:rPr>
+                <w:rFonts w:ascii="Calibri" w:cs="Calibri" w:eastAsia="Calibri" w:hAnsi="Calibri"/>
+                <w:sz w:val="19"/>
+                <w:szCs w:val="19"/>
+              </w:rPr>
+              <w:t xml:space="preserve">Sender</w:t>
+            </w:r>
+            <w:r>
+              <w:rPr>
+                <w:rFonts w:ascii="Calibri" w:cs="Calibri" w:eastAsia="Calibri" w:hAnsi="Calibri"/>
+                <w:sz w:val="19"/>
+                <w:szCs w:val="19"/>
+              </w:rPr>
+              <w:t xml:space="preserve"> field on Email and SMS / MMS steps, the workspace default unless another is picked.</w:t>
+            </w:r>
+          </w:p>
+        </w:tc>
+      </w:tr>
+      <w:tr>
+        <w:tc>
+          <w:tcPr>
+            <w:tcW w:type="dxa" w:w="2340"/>
+            <w:tcBorders>
+              <w:top w:val="single" w:color="C9CDD8" w:sz="4"/>
+              <w:left w:val="single" w:color="C9CDD8" w:sz="4"/>
+              <w:bottom w:val="single" w:color="C9CDD8" w:sz="4"/>
+              <w:right w:val="single" w:color="C9CDD8" w:sz="4"/>
+            </w:tcBorders>
+            <w:tcMar>
+              <w:top w:type="dxa" w:w="60"/>
+              <w:left w:type="dxa" w:w="100"/>
+              <w:bottom w:type="dxa" w:w="60"/>
+              <w:right w:type="dxa" w:w="100"/>
+            </w:tcMar>
+          </w:tcPr>
+          <w:p>
+            <w:pPr>
+              <w:spacing w:after="0"/>
+            </w:pPr>
+            <w:r>
+              <w:rPr>
+                <w:rFonts w:ascii="Calibri" w:cs="Calibri" w:eastAsia="Calibri" w:hAnsi="Calibri"/>
+                <w:sz w:val="19"/>
+                <w:szCs w:val="19"/>
+              </w:rPr>
+              <w:t xml:space="preserve">Test Publish skips waits only</w:t>
+            </w:r>
+          </w:p>
+        </w:tc>
+        <w:tc>
+          <w:tcPr>
+            <w:tcW w:type="dxa" w:w="7020"/>
+            <w:tcBorders>
+              <w:top w:val="single" w:color="C9CDD8" w:sz="4"/>
+              <w:left w:val="single" w:color="C9CDD8" w:sz="4"/>
+              <w:bottom w:val="single" w:color="C9CDD8" w:sz="4"/>
+              <w:right w:val="single" w:color="C9CDD8" w:sz="4"/>
+            </w:tcBorders>
+            <w:tcMar>
+              <w:top w:type="dxa" w:w="60"/>
+              <w:left w:type="dxa" w:w="100"/>
+              <w:bottom w:type="dxa" w:w="60"/>
+              <w:right w:type="dxa" w:w="100"/>
+            </w:tcMar>
+          </w:tcPr>
+          <w:p>
+            <w:pPr>
+              <w:spacing w:after="0"/>
+            </w:pPr>
+            <w:r>
+              <w:rPr>
+                <w:rFonts w:ascii="Calibri" w:cs="Calibri" w:eastAsia="Calibri" w:hAnsi="Calibri"/>
+                <w:sz w:val="19"/>
+                <w:szCs w:val="19"/>
+              </w:rPr>
+              <w:t xml:space="preserve">Unchanged, by design: Preview Route asks which way to assume a step that depends on what has not happened yet.</w:t>
+            </w:r>
+          </w:p>
+        </w:tc>
+      </w:tr>
+      <w:tr>
+        <w:tc>
+          <w:tcPr>
+            <w:tcW w:type="dxa" w:w="2340"/>
+            <w:tcBorders>
+              <w:top w:val="single" w:color="C9CDD8" w:sz="4"/>
+              <w:left w:val="single" w:color="C9CDD8" w:sz="4"/>
+              <w:bottom w:val="single" w:color="C9CDD8" w:sz="4"/>
+              <w:right w:val="single" w:color="C9CDD8" w:sz="4"/>
+            </w:tcBorders>
+            <w:tcMar>
+              <w:top w:type="dxa" w:w="60"/>
+              <w:left w:type="dxa" w:w="100"/>
+              <w:bottom w:type="dxa" w:w="60"/>
+              <w:right w:type="dxa" w:w="100"/>
+            </w:tcMar>
+          </w:tcPr>
+          <w:p>
+            <w:pPr>
+              <w:spacing w:after="0"/>
+            </w:pPr>
+            <w:r>
+              <w:rPr>
+                <w:rFonts w:ascii="Calibri" w:cs="Calibri" w:eastAsia="Calibri" w:hAnsi="Calibri"/>
+                <w:sz w:val="19"/>
+                <w:szCs w:val="19"/>
+              </w:rPr>
+              <w:t xml:space="preserve">Journey timelines are not searchable by event</w:t>
+            </w:r>
+          </w:p>
+        </w:tc>
+        <w:tc>
+          <w:tcPr>
+            <w:tcW w:type="dxa" w:w="7020"/>
+            <w:tcBorders>
+              <w:top w:val="single" w:color="C9CDD8" w:sz="4"/>
+              <w:left w:val="single" w:color="C9CDD8" w:sz="4"/>
+              <w:bottom w:val="single" w:color="C9CDD8" w:sz="4"/>
+              <w:right w:val="single" w:color="C9CDD8" w:sz="4"/>
+            </w:tcBorders>
+            <w:tcMar>
+              <w:top w:type="dxa" w:w="60"/>
+              <w:left w:type="dxa" w:w="100"/>
+              <w:bottom w:type="dxa" w:w="60"/>
+              <w:right w:type="dxa" w:w="100"/>
+            </w:tcMar>
+          </w:tcPr>
+          <w:p>
+            <w:pPr>
+              <w:spacing w:after="0"/>
+            </w:pPr>
+            <w:r>
+              <w:rPr>
+                <w:rFonts w:ascii="Calibri" w:cs="Calibri" w:eastAsia="Calibri" w:hAnsi="Calibri"/>
+                <w:sz w:val="19"/>
+                <w:szCs w:val="19"/>
+              </w:rPr>
+              <w:t xml:space="preserve">The Customers card filters by </w:t>
+            </w:r>
+            <w:r>
+              <w:rPr>
+                <w:rFonts w:ascii="Calibri" w:cs="Calibri" w:eastAsia="Calibri" w:hAnsi="Calibri"/>
+                <w:sz w:val="19"/>
+                <w:szCs w:val="19"/>
+              </w:rPr>
+              <w:t xml:space="preserve">Held Back Reason</w:t>
+            </w:r>
+            <w:r>
+              <w:rPr>
+                <w:rFonts w:ascii="Calibri" w:cs="Calibri" w:eastAsia="Calibri" w:hAnsi="Calibri"/>
+                <w:sz w:val="19"/>
+                <w:szCs w:val="19"/>
+              </w:rPr>
+              <w:t xml:space="preserve">, with how many customers each, and the export follows the filter.</w:t>
+            </w:r>
+          </w:p>
+        </w:tc>
+      </w:tr>
+    </w:tbl>
+    <w:p>
+      <w:pPr>
+        <w:spacing w:after="120"/>
+      </w:pPr>
+    </w:p>
+    <w:p>
+      <w:pPr>
+        <w:pStyle w:val="Heading2"/>
+      </w:pPr>
+      <w:r>
+        <w:rPr>
+          <w:rFonts w:ascii="Calibri" w:cs="Calibri" w:eastAsia="Calibri" w:hAnsi="Calibri"/>
+        </w:rPr>
+        <w:t xml:space="preserve">12.2 Gaps in Data and Integrations</w:t>
       </w:r>
     </w:p>
     <w:tbl>
@@ -16839,712 +17414,6 @@
                 <w:sz w:val="19"/>
                 <w:szCs w:val="19"/>
               </w:rPr>
-              <w:t xml:space="preserve">No customer record page</w:t>
-            </w:r>
-          </w:p>
-        </w:tc>
-        <w:tc>
-          <w:tcPr>
-            <w:tcW w:type="dxa" w:w="3510"/>
-            <w:tcBorders>
-              <w:top w:val="single" w:color="C9CDD8" w:sz="4"/>
-              <w:left w:val="single" w:color="C9CDD8" w:sz="4"/>
-              <w:bottom w:val="single" w:color="C9CDD8" w:sz="4"/>
-              <w:right w:val="single" w:color="C9CDD8" w:sz="4"/>
-            </w:tcBorders>
-            <w:tcMar>
-              <w:top w:type="dxa" w:w="60"/>
-              <w:left w:type="dxa" w:w="100"/>
-              <w:bottom w:type="dxa" w:w="60"/>
-              <w:right w:type="dxa" w:w="100"/>
-            </w:tcMar>
-          </w:tcPr>
-          <w:p>
-            <w:pPr>
-              <w:spacing w:after="0"/>
-            </w:pPr>
-            <w:r>
-              <w:rPr>
-                <w:rFonts w:ascii="Calibri" w:cs="Calibri" w:eastAsia="Calibri" w:hAnsi="Calibri"/>
-                <w:sz w:val="19"/>
-                <w:szCs w:val="19"/>
-              </w:rPr>
-              <w:t xml:space="preserve">A customer's journey timeline is reached only from the journey's Customers card; there is no single page showing one customer across journeys, campaigns and events.</w:t>
-            </w:r>
-          </w:p>
-        </w:tc>
-        <w:tc>
-          <w:tcPr>
-            <w:tcW w:type="dxa" w:w="3510"/>
-            <w:tcBorders>
-              <w:top w:val="single" w:color="C9CDD8" w:sz="4"/>
-              <w:left w:val="single" w:color="C9CDD8" w:sz="4"/>
-              <w:bottom w:val="single" w:color="C9CDD8" w:sz="4"/>
-              <w:right w:val="single" w:color="C9CDD8" w:sz="4"/>
-            </w:tcBorders>
-            <w:tcMar>
-              <w:top w:type="dxa" w:w="60"/>
-              <w:left w:type="dxa" w:w="100"/>
-              <w:bottom w:type="dxa" w:w="60"/>
-              <w:right w:type="dxa" w:w="100"/>
-            </w:tcMar>
-          </w:tcPr>
-          <w:p>
-            <w:pPr>
-              <w:spacing w:after="0"/>
-            </w:pPr>
-            <w:r>
-              <w:rPr>
-                <w:rFonts w:ascii="Calibri" w:cs="Calibri" w:eastAsia="Calibri" w:hAnsi="Calibri"/>
-                <w:sz w:val="19"/>
-                <w:szCs w:val="19"/>
-              </w:rPr>
-              <w:t xml:space="preserve">A customer page under Audiences with the record, consent, the events received and every journey timeline.</w:t>
-            </w:r>
-          </w:p>
-        </w:tc>
-      </w:tr>
-      <w:tr>
-        <w:tc>
-          <w:tcPr>
-            <w:tcW w:type="dxa" w:w="2340"/>
-            <w:tcBorders>
-              <w:top w:val="single" w:color="C9CDD8" w:sz="4"/>
-              <w:left w:val="single" w:color="C9CDD8" w:sz="4"/>
-              <w:bottom w:val="single" w:color="C9CDD8" w:sz="4"/>
-              <w:right w:val="single" w:color="C9CDD8" w:sz="4"/>
-            </w:tcBorders>
-            <w:tcMar>
-              <w:top w:type="dxa" w:w="60"/>
-              <w:left w:type="dxa" w:w="100"/>
-              <w:bottom w:type="dxa" w:w="60"/>
-              <w:right w:type="dxa" w:w="100"/>
-            </w:tcMar>
-          </w:tcPr>
-          <w:p>
-            <w:pPr>
-              <w:spacing w:after="0"/>
-            </w:pPr>
-            <w:r>
-              <w:rPr>
-                <w:rFonts w:ascii="Calibri" w:cs="Calibri" w:eastAsia="Calibri" w:hAnsi="Calibri"/>
-                <w:sz w:val="19"/>
-                <w:szCs w:val="19"/>
-              </w:rPr>
-              <w:t xml:space="preserve">No report engine and no Journeys dataset</w:t>
-            </w:r>
-          </w:p>
-        </w:tc>
-        <w:tc>
-          <w:tcPr>
-            <w:tcW w:type="dxa" w:w="3510"/>
-            <w:tcBorders>
-              <w:top w:val="single" w:color="C9CDD8" w:sz="4"/>
-              <w:left w:val="single" w:color="C9CDD8" w:sz="4"/>
-              <w:bottom w:val="single" w:color="C9CDD8" w:sz="4"/>
-              <w:right w:val="single" w:color="C9CDD8" w:sz="4"/>
-            </w:tcBorders>
-            <w:tcMar>
-              <w:top w:type="dxa" w:w="60"/>
-              <w:left w:type="dxa" w:w="100"/>
-              <w:bottom w:type="dxa" w:w="60"/>
-              <w:right w:type="dxa" w:w="100"/>
-            </w:tcMar>
-          </w:tcPr>
-          <w:p>
-            <w:pPr>
-              <w:spacing w:after="0"/>
-            </w:pPr>
-            <w:r>
-              <w:rPr>
-                <w:rFonts w:ascii="Calibri" w:cs="Calibri" w:eastAsia="Calibri" w:hAnsi="Calibri"/>
-                <w:sz w:val="19"/>
-                <w:szCs w:val="19"/>
-              </w:rPr>
-              <w:t xml:space="preserve">The nightly roll-up fills </w:t>
-            </w:r>
-            <w:r>
-              <w:rPr>
-                <w:rFonts w:ascii="Consolas" w:cs="Consolas" w:eastAsia="Consolas" w:hAnsi="Consolas"/>
-                <w:sz w:val="19"/>
-                <w:szCs w:val="19"/>
-              </w:rPr>
-              <w:t xml:space="preserve">journey_master_analytical</w:t>
-            </w:r>
-            <w:r>
-              <w:rPr>
-                <w:rFonts w:ascii="Calibri" w:cs="Calibri" w:eastAsia="Calibri" w:hAnsi="Calibri"/>
-                <w:sz w:val="19"/>
-                <w:szCs w:val="19"/>
-              </w:rPr>
-              <w:t xml:space="preserve"> but nothing in the app reads it beyond the Performance card; no cross-journey report, no export of the roll-up.</w:t>
-            </w:r>
-          </w:p>
-        </w:tc>
-        <w:tc>
-          <w:tcPr>
-            <w:tcW w:type="dxa" w:w="3510"/>
-            <w:tcBorders>
-              <w:top w:val="single" w:color="C9CDD8" w:sz="4"/>
-              <w:left w:val="single" w:color="C9CDD8" w:sz="4"/>
-              <w:bottom w:val="single" w:color="C9CDD8" w:sz="4"/>
-              <w:right w:val="single" w:color="C9CDD8" w:sz="4"/>
-            </w:tcBorders>
-            <w:tcMar>
-              <w:top w:type="dxa" w:w="60"/>
-              <w:left w:type="dxa" w:w="100"/>
-              <w:bottom w:type="dxa" w:w="60"/>
-              <w:right w:type="dxa" w:w="100"/>
-            </w:tcMar>
-          </w:tcPr>
-          <w:p>
-            <w:pPr>
-              <w:spacing w:after="0"/>
-            </w:pPr>
-            <w:r>
-              <w:rPr>
-                <w:rFonts w:ascii="Calibri" w:cs="Calibri" w:eastAsia="Calibri" w:hAnsi="Calibri"/>
-                <w:sz w:val="19"/>
-                <w:szCs w:val="19"/>
-              </w:rPr>
-              <w:t xml:space="preserve">A Journeys dataset in Reports (per journey per day: entered, converted, revenue, messages) with the usual filters and CSV.</w:t>
-            </w:r>
-          </w:p>
-        </w:tc>
-      </w:tr>
-      <w:tr>
-        <w:tc>
-          <w:tcPr>
-            <w:tcW w:type="dxa" w:w="2340"/>
-            <w:tcBorders>
-              <w:top w:val="single" w:color="C9CDD8" w:sz="4"/>
-              <w:left w:val="single" w:color="C9CDD8" w:sz="4"/>
-              <w:bottom w:val="single" w:color="C9CDD8" w:sz="4"/>
-              <w:right w:val="single" w:color="C9CDD8" w:sz="4"/>
-            </w:tcBorders>
-            <w:tcMar>
-              <w:top w:type="dxa" w:w="60"/>
-              <w:left w:type="dxa" w:w="100"/>
-              <w:bottom w:type="dxa" w:w="60"/>
-              <w:right w:type="dxa" w:w="100"/>
-            </w:tcMar>
-          </w:tcPr>
-          <w:p>
-            <w:pPr>
-              <w:spacing w:after="0"/>
-            </w:pPr>
-            <w:r>
-              <w:rPr>
-                <w:rFonts w:ascii="Calibri" w:cs="Calibri" w:eastAsia="Calibri" w:hAnsi="Calibri"/>
-                <w:sz w:val="19"/>
-                <w:szCs w:val="19"/>
-              </w:rPr>
-              <w:t xml:space="preserve">No save-as-template</w:t>
-            </w:r>
-          </w:p>
-        </w:tc>
-        <w:tc>
-          <w:tcPr>
-            <w:tcW w:type="dxa" w:w="3510"/>
-            <w:tcBorders>
-              <w:top w:val="single" w:color="C9CDD8" w:sz="4"/>
-              <w:left w:val="single" w:color="C9CDD8" w:sz="4"/>
-              <w:bottom w:val="single" w:color="C9CDD8" w:sz="4"/>
-              <w:right w:val="single" w:color="C9CDD8" w:sz="4"/>
-            </w:tcBorders>
-            <w:tcMar>
-              <w:top w:type="dxa" w:w="60"/>
-              <w:left w:type="dxa" w:w="100"/>
-              <w:bottom w:type="dxa" w:w="60"/>
-              <w:right w:type="dxa" w:w="100"/>
-            </w:tcMar>
-          </w:tcPr>
-          <w:p>
-            <w:pPr>
-              <w:spacing w:after="0"/>
-            </w:pPr>
-            <w:r>
-              <w:rPr>
-                <w:rFonts w:ascii="Calibri" w:cs="Calibri" w:eastAsia="Calibri" w:hAnsi="Calibri"/>
-                <w:sz w:val="19"/>
-                <w:szCs w:val="19"/>
-              </w:rPr>
-              <w:t xml:space="preserve">A well-built journey cannot be reused as a starter; Duplicate copies it within the workspace only.</w:t>
-            </w:r>
-          </w:p>
-        </w:tc>
-        <w:tc>
-          <w:tcPr>
-            <w:tcW w:type="dxa" w:w="3510"/>
-            <w:tcBorders>
-              <w:top w:val="single" w:color="C9CDD8" w:sz="4"/>
-              <w:left w:val="single" w:color="C9CDD8" w:sz="4"/>
-              <w:bottom w:val="single" w:color="C9CDD8" w:sz="4"/>
-              <w:right w:val="single" w:color="C9CDD8" w:sz="4"/>
-            </w:tcBorders>
-            <w:tcMar>
-              <w:top w:type="dxa" w:w="60"/>
-              <w:left w:type="dxa" w:w="100"/>
-              <w:bottom w:type="dxa" w:w="60"/>
-              <w:right w:type="dxa" w:w="100"/>
-            </w:tcMar>
-          </w:tcPr>
-          <w:p>
-            <w:pPr>
-              <w:spacing w:after="0"/>
-            </w:pPr>
-            <w:r>
-              <w:rPr>
-                <w:rFonts w:ascii="Calibri" w:cs="Calibri" w:eastAsia="Calibri" w:hAnsi="Calibri"/>
-                <w:sz w:val="19"/>
-                <w:szCs w:val="19"/>
-              </w:rPr>
-              <w:t xml:space="preserve">A Save as Template action writing to the workspace's template catalogue, and a platform catalogue for shared starters.</w:t>
-            </w:r>
-          </w:p>
-        </w:tc>
-      </w:tr>
-      <w:tr>
-        <w:tc>
-          <w:tcPr>
-            <w:tcW w:type="dxa" w:w="2340"/>
-            <w:tcBorders>
-              <w:top w:val="single" w:color="C9CDD8" w:sz="4"/>
-              <w:left w:val="single" w:color="C9CDD8" w:sz="4"/>
-              <w:bottom w:val="single" w:color="C9CDD8" w:sz="4"/>
-              <w:right w:val="single" w:color="C9CDD8" w:sz="4"/>
-            </w:tcBorders>
-            <w:tcMar>
-              <w:top w:type="dxa" w:w="60"/>
-              <w:left w:type="dxa" w:w="100"/>
-              <w:bottom w:type="dxa" w:w="60"/>
-              <w:right w:type="dxa" w:w="100"/>
-            </w:tcMar>
-          </w:tcPr>
-          <w:p>
-            <w:pPr>
-              <w:spacing w:after="0"/>
-            </w:pPr>
-            <w:r>
-              <w:rPr>
-                <w:rFonts w:ascii="Calibri" w:cs="Calibri" w:eastAsia="Calibri" w:hAnsi="Calibri"/>
-                <w:sz w:val="19"/>
-                <w:szCs w:val="19"/>
-              </w:rPr>
-              <w:t xml:space="preserve">Message steps have no sender choice</w:t>
-            </w:r>
-          </w:p>
-        </w:tc>
-        <w:tc>
-          <w:tcPr>
-            <w:tcW w:type="dxa" w:w="3510"/>
-            <w:tcBorders>
-              <w:top w:val="single" w:color="C9CDD8" w:sz="4"/>
-              <w:left w:val="single" w:color="C9CDD8" w:sz="4"/>
-              <w:bottom w:val="single" w:color="C9CDD8" w:sz="4"/>
-              <w:right w:val="single" w:color="C9CDD8" w:sz="4"/>
-            </w:tcBorders>
-            <w:tcMar>
-              <w:top w:type="dxa" w:w="60"/>
-              <w:left w:type="dxa" w:w="100"/>
-              <w:bottom w:type="dxa" w:w="60"/>
-              <w:right w:type="dxa" w:w="100"/>
-            </w:tcMar>
-          </w:tcPr>
-          <w:p>
-            <w:pPr>
-              <w:spacing w:after="0"/>
-            </w:pPr>
-            <w:r>
-              <w:rPr>
-                <w:rFonts w:ascii="Calibri" w:cs="Calibri" w:eastAsia="Calibri" w:hAnsi="Calibri"/>
-                <w:sz w:val="19"/>
-                <w:szCs w:val="19"/>
-              </w:rPr>
-              <w:t xml:space="preserve">Every journey message goes from the engine's default sender.</w:t>
-            </w:r>
-          </w:p>
-        </w:tc>
-        <w:tc>
-          <w:tcPr>
-            <w:tcW w:type="dxa" w:w="3510"/>
-            <w:tcBorders>
-              <w:top w:val="single" w:color="C9CDD8" w:sz="4"/>
-              <w:left w:val="single" w:color="C9CDD8" w:sz="4"/>
-              <w:bottom w:val="single" w:color="C9CDD8" w:sz="4"/>
-              <w:right w:val="single" w:color="C9CDD8" w:sz="4"/>
-            </w:tcBorders>
-            <w:tcMar>
-              <w:top w:type="dxa" w:w="60"/>
-              <w:left w:type="dxa" w:w="100"/>
-              <w:bottom w:type="dxa" w:w="60"/>
-              <w:right w:type="dxa" w:w="100"/>
-            </w:tcMar>
-          </w:tcPr>
-          <w:p>
-            <w:pPr>
-              <w:spacing w:after="0"/>
-            </w:pPr>
-            <w:r>
-              <w:rPr>
-                <w:rFonts w:ascii="Calibri" w:cs="Calibri" w:eastAsia="Calibri" w:hAnsi="Calibri"/>
-                <w:sz w:val="19"/>
-                <w:szCs w:val="19"/>
-              </w:rPr>
-              <w:t xml:space="preserve">A sender field on the message step, as on a campaign.</w:t>
-            </w:r>
-          </w:p>
-        </w:tc>
-      </w:tr>
-      <w:tr>
-        <w:tc>
-          <w:tcPr>
-            <w:tcW w:type="dxa" w:w="2340"/>
-            <w:tcBorders>
-              <w:top w:val="single" w:color="C9CDD8" w:sz="4"/>
-              <w:left w:val="single" w:color="C9CDD8" w:sz="4"/>
-              <w:bottom w:val="single" w:color="C9CDD8" w:sz="4"/>
-              <w:right w:val="single" w:color="C9CDD8" w:sz="4"/>
-            </w:tcBorders>
-            <w:tcMar>
-              <w:top w:type="dxa" w:w="60"/>
-              <w:left w:type="dxa" w:w="100"/>
-              <w:bottom w:type="dxa" w:w="60"/>
-              <w:right w:type="dxa" w:w="100"/>
-            </w:tcMar>
-          </w:tcPr>
-          <w:p>
-            <w:pPr>
-              <w:spacing w:after="0"/>
-            </w:pPr>
-            <w:r>
-              <w:rPr>
-                <w:rFonts w:ascii="Calibri" w:cs="Calibri" w:eastAsia="Calibri" w:hAnsi="Calibri"/>
-                <w:sz w:val="19"/>
-                <w:szCs w:val="19"/>
-              </w:rPr>
-              <w:t xml:space="preserve">Test Publish skips waits only</w:t>
-            </w:r>
-          </w:p>
-        </w:tc>
-        <w:tc>
-          <w:tcPr>
-            <w:tcW w:type="dxa" w:w="3510"/>
-            <w:tcBorders>
-              <w:top w:val="single" w:color="C9CDD8" w:sz="4"/>
-              <w:left w:val="single" w:color="C9CDD8" w:sz="4"/>
-              <w:bottom w:val="single" w:color="C9CDD8" w:sz="4"/>
-              <w:right w:val="single" w:color="C9CDD8" w:sz="4"/>
-            </w:tcBorders>
-            <w:tcMar>
-              <w:top w:type="dxa" w:w="60"/>
-              <w:left w:type="dxa" w:w="100"/>
-              <w:bottom w:type="dxa" w:w="60"/>
-              <w:right w:type="dxa" w:w="100"/>
-            </w:tcMar>
-          </w:tcPr>
-          <w:p>
-            <w:pPr>
-              <w:spacing w:after="0"/>
-            </w:pPr>
-            <w:r>
-              <w:rPr>
-                <w:rFonts w:ascii="Calibri" w:cs="Calibri" w:eastAsia="Calibri" w:hAnsi="Calibri"/>
-                <w:sz w:val="19"/>
-                <w:szCs w:val="19"/>
-              </w:rPr>
-              <w:t xml:space="preserve">A test cannot exercise a Condition on a message outcome or a Goal, because nothing has happened yet; Preview Route asks for assumptions instead.</w:t>
-            </w:r>
-          </w:p>
-        </w:tc>
-        <w:tc>
-          <w:tcPr>
-            <w:tcW w:type="dxa" w:w="3510"/>
-            <w:tcBorders>
-              <w:top w:val="single" w:color="C9CDD8" w:sz="4"/>
-              <w:left w:val="single" w:color="C9CDD8" w:sz="4"/>
-              <w:bottom w:val="single" w:color="C9CDD8" w:sz="4"/>
-              <w:right w:val="single" w:color="C9CDD8" w:sz="4"/>
-            </w:tcBorders>
-            <w:tcMar>
-              <w:top w:type="dxa" w:w="60"/>
-              <w:left w:type="dxa" w:w="100"/>
-              <w:bottom w:type="dxa" w:w="60"/>
-              <w:right w:type="dxa" w:w="100"/>
-            </w:tcMar>
-          </w:tcPr>
-          <w:p>
-            <w:pPr>
-              <w:spacing w:after="0"/>
-            </w:pPr>
-            <w:r>
-              <w:rPr>
-                <w:rFonts w:ascii="Calibri" w:cs="Calibri" w:eastAsia="Calibri" w:hAnsi="Calibri"/>
-                <w:sz w:val="19"/>
-                <w:szCs w:val="19"/>
-              </w:rPr>
-              <w:t xml:space="preserve">Acceptable for now; document it in training.</w:t>
-            </w:r>
-          </w:p>
-        </w:tc>
-      </w:tr>
-      <w:tr>
-        <w:tc>
-          <w:tcPr>
-            <w:tcW w:type="dxa" w:w="2340"/>
-            <w:tcBorders>
-              <w:top w:val="single" w:color="C9CDD8" w:sz="4"/>
-              <w:left w:val="single" w:color="C9CDD8" w:sz="4"/>
-              <w:bottom w:val="single" w:color="C9CDD8" w:sz="4"/>
-              <w:right w:val="single" w:color="C9CDD8" w:sz="4"/>
-            </w:tcBorders>
-            <w:tcMar>
-              <w:top w:type="dxa" w:w="60"/>
-              <w:left w:type="dxa" w:w="100"/>
-              <w:bottom w:type="dxa" w:w="60"/>
-              <w:right w:type="dxa" w:w="100"/>
-            </w:tcMar>
-          </w:tcPr>
-          <w:p>
-            <w:pPr>
-              <w:spacing w:after="0"/>
-            </w:pPr>
-            <w:r>
-              <w:rPr>
-                <w:rFonts w:ascii="Calibri" w:cs="Calibri" w:eastAsia="Calibri" w:hAnsi="Calibri"/>
-                <w:sz w:val="19"/>
-                <w:szCs w:val="19"/>
-              </w:rPr>
-              <w:t xml:space="preserve">Journey timelines are not searchable by event</w:t>
-            </w:r>
-          </w:p>
-        </w:tc>
-        <w:tc>
-          <w:tcPr>
-            <w:tcW w:type="dxa" w:w="3510"/>
-            <w:tcBorders>
-              <w:top w:val="single" w:color="C9CDD8" w:sz="4"/>
-              <w:left w:val="single" w:color="C9CDD8" w:sz="4"/>
-              <w:bottom w:val="single" w:color="C9CDD8" w:sz="4"/>
-              <w:right w:val="single" w:color="C9CDD8" w:sz="4"/>
-            </w:tcBorders>
-            <w:tcMar>
-              <w:top w:type="dxa" w:w="60"/>
-              <w:left w:type="dxa" w:w="100"/>
-              <w:bottom w:type="dxa" w:w="60"/>
-              <w:right w:type="dxa" w:w="100"/>
-            </w:tcMar>
-          </w:tcPr>
-          <w:p>
-            <w:pPr>
-              <w:spacing w:after="0"/>
-            </w:pPr>
-            <w:r>
-              <w:rPr>
-                <w:rFonts w:ascii="Calibri" w:cs="Calibri" w:eastAsia="Calibri" w:hAnsi="Calibri"/>
-                <w:sz w:val="19"/>
-                <w:szCs w:val="19"/>
-              </w:rPr>
-              <w:t xml:space="preserve">Finding every customer who was held back for a given reason means opening each timeline.</w:t>
-            </w:r>
-          </w:p>
-        </w:tc>
-        <w:tc>
-          <w:tcPr>
-            <w:tcW w:type="dxa" w:w="3510"/>
-            <w:tcBorders>
-              <w:top w:val="single" w:color="C9CDD8" w:sz="4"/>
-              <w:left w:val="single" w:color="C9CDD8" w:sz="4"/>
-              <w:bottom w:val="single" w:color="C9CDD8" w:sz="4"/>
-              <w:right w:val="single" w:color="C9CDD8" w:sz="4"/>
-            </w:tcBorders>
-            <w:tcMar>
-              <w:top w:type="dxa" w:w="60"/>
-              <w:left w:type="dxa" w:w="100"/>
-              <w:bottom w:type="dxa" w:w="60"/>
-              <w:right w:type="dxa" w:w="100"/>
-            </w:tcMar>
-          </w:tcPr>
-          <w:p>
-            <w:pPr>
-              <w:spacing w:after="0"/>
-            </w:pPr>
-            <w:r>
-              <w:rPr>
-                <w:rFonts w:ascii="Calibri" w:cs="Calibri" w:eastAsia="Calibri" w:hAnsi="Calibri"/>
-                <w:sz w:val="19"/>
-                <w:szCs w:val="19"/>
-              </w:rPr>
-              <w:t xml:space="preserve">A reason filter on the Customers card.</w:t>
-            </w:r>
-          </w:p>
-        </w:tc>
-      </w:tr>
-    </w:tbl>
-    <w:p>
-      <w:pPr>
-        <w:spacing w:after="120"/>
-      </w:pPr>
-    </w:p>
-    <w:p>
-      <w:pPr>
-        <w:pStyle w:val="Heading2"/>
-      </w:pPr>
-      <w:r>
-        <w:rPr>
-          <w:rFonts w:ascii="Calibri" w:cs="Calibri" w:eastAsia="Calibri" w:hAnsi="Calibri"/>
-        </w:rPr>
-        <w:t xml:space="preserve">12.2 Gaps in Data and Integrations</w:t>
-      </w:r>
-    </w:p>
-    <w:tbl>
-      <w:tblPr>
-        <w:tblW w:type="dxa" w:w="9360"/>
-        <w:tblBorders>
-          <w:top w:val="single" w:color="auto" w:sz="4"/>
-          <w:left w:val="single" w:color="auto" w:sz="4"/>
-          <w:bottom w:val="single" w:color="auto" w:sz="4"/>
-          <w:right w:val="single" w:color="auto" w:sz="4"/>
-          <w:insideH w:val="single" w:color="auto" w:sz="4"/>
-          <w:insideV w:val="single" w:color="auto" w:sz="4"/>
-        </w:tblBorders>
-      </w:tblPr>
-      <w:tblGrid>
-        <w:gridCol w:w="2340"/>
-        <w:gridCol w:w="3510"/>
-        <w:gridCol w:w="3510"/>
-      </w:tblGrid>
-      <w:tr>
-        <w:trPr>
-          <w:tblHeader/>
-        </w:trPr>
-        <w:tc>
-          <w:tcPr>
-            <w:tcW w:type="dxa" w:w="2340"/>
-            <w:tcBorders>
-              <w:top w:val="single" w:color="C9CDD8" w:sz="4"/>
-              <w:left w:val="single" w:color="C9CDD8" w:sz="4"/>
-              <w:bottom w:val="single" w:color="C9CDD8" w:sz="4"/>
-              <w:right w:val="single" w:color="C9CDD8" w:sz="4"/>
-            </w:tcBorders>
-            <w:shd w:fill="EEF1F8" w:color="auto" w:val="clear"/>
-            <w:tcMar>
-              <w:top w:type="dxa" w:w="60"/>
-              <w:left w:type="dxa" w:w="100"/>
-              <w:bottom w:type="dxa" w:w="60"/>
-              <w:right w:type="dxa" w:w="100"/>
-            </w:tcMar>
-          </w:tcPr>
-          <w:p>
-            <w:pPr>
-              <w:spacing w:after="0"/>
-            </w:pPr>
-            <w:r>
-              <w:rPr>
-                <w:rFonts w:ascii="Calibri" w:cs="Calibri" w:eastAsia="Calibri" w:hAnsi="Calibri"/>
-                <w:b/>
-                <w:bCs/>
-                <w:sz w:val="19"/>
-                <w:szCs w:val="19"/>
-              </w:rPr>
-              <w:t xml:space="preserve">Gap</w:t>
-            </w:r>
-          </w:p>
-        </w:tc>
-        <w:tc>
-          <w:tcPr>
-            <w:tcW w:type="dxa" w:w="3510"/>
-            <w:tcBorders>
-              <w:top w:val="single" w:color="C9CDD8" w:sz="4"/>
-              <w:left w:val="single" w:color="C9CDD8" w:sz="4"/>
-              <w:bottom w:val="single" w:color="C9CDD8" w:sz="4"/>
-              <w:right w:val="single" w:color="C9CDD8" w:sz="4"/>
-            </w:tcBorders>
-            <w:shd w:fill="EEF1F8" w:color="auto" w:val="clear"/>
-            <w:tcMar>
-              <w:top w:type="dxa" w:w="60"/>
-              <w:left w:type="dxa" w:w="100"/>
-              <w:bottom w:type="dxa" w:w="60"/>
-              <w:right w:type="dxa" w:w="100"/>
-            </w:tcMar>
-          </w:tcPr>
-          <w:p>
-            <w:pPr>
-              <w:spacing w:after="0"/>
-            </w:pPr>
-            <w:r>
-              <w:rPr>
-                <w:rFonts w:ascii="Calibri" w:cs="Calibri" w:eastAsia="Calibri" w:hAnsi="Calibri"/>
-                <w:b/>
-                <w:bCs/>
-                <w:sz w:val="19"/>
-                <w:szCs w:val="19"/>
-              </w:rPr>
-              <w:t xml:space="preserve">What it blocks</w:t>
-            </w:r>
-          </w:p>
-        </w:tc>
-        <w:tc>
-          <w:tcPr>
-            <w:tcW w:type="dxa" w:w="3510"/>
-            <w:tcBorders>
-              <w:top w:val="single" w:color="C9CDD8" w:sz="4"/>
-              <w:left w:val="single" w:color="C9CDD8" w:sz="4"/>
-              <w:bottom w:val="single" w:color="C9CDD8" w:sz="4"/>
-              <w:right w:val="single" w:color="C9CDD8" w:sz="4"/>
-            </w:tcBorders>
-            <w:shd w:fill="EEF1F8" w:color="auto" w:val="clear"/>
-            <w:tcMar>
-              <w:top w:type="dxa" w:w="60"/>
-              <w:left w:type="dxa" w:w="100"/>
-              <w:bottom w:type="dxa" w:w="60"/>
-              <w:right w:type="dxa" w:w="100"/>
-            </w:tcMar>
-          </w:tcPr>
-          <w:p>
-            <w:pPr>
-              <w:spacing w:after="0"/>
-            </w:pPr>
-            <w:r>
-              <w:rPr>
-                <w:rFonts w:ascii="Calibri" w:cs="Calibri" w:eastAsia="Calibri" w:hAnsi="Calibri"/>
-                <w:b/>
-                <w:bCs/>
-                <w:sz w:val="19"/>
-                <w:szCs w:val="19"/>
-              </w:rPr>
-              <w:t xml:space="preserve">Fills it</w:t>
-            </w:r>
-          </w:p>
-        </w:tc>
-      </w:tr>
-      <w:tr>
-        <w:tc>
-          <w:tcPr>
-            <w:tcW w:type="dxa" w:w="2340"/>
-            <w:tcBorders>
-              <w:top w:val="single" w:color="C9CDD8" w:sz="4"/>
-              <w:left w:val="single" w:color="C9CDD8" w:sz="4"/>
-              <w:bottom w:val="single" w:color="C9CDD8" w:sz="4"/>
-              <w:right w:val="single" w:color="C9CDD8" w:sz="4"/>
-            </w:tcBorders>
-            <w:tcMar>
-              <w:top w:type="dxa" w:w="60"/>
-              <w:left w:type="dxa" w:w="100"/>
-              <w:bottom w:type="dxa" w:w="60"/>
-              <w:right w:type="dxa" w:w="100"/>
-            </w:tcMar>
-          </w:tcPr>
-          <w:p>
-            <w:pPr>
-              <w:spacing w:after="0"/>
-            </w:pPr>
-            <w:r>
-              <w:rPr>
-                <w:rFonts w:ascii="Calibri" w:cs="Calibri" w:eastAsia="Calibri" w:hAnsi="Calibri"/>
-                <w:sz w:val="19"/>
-                <w:szCs w:val="19"/>
-              </w:rPr>
               <w:t xml:space="preserve">C360 feeds are not running into the development workspace</w:t>
             </w:r>
           </w:p>
@@ -18670,7 +18539,7 @@
         <w:rPr>
           <w:rFonts w:ascii="Calibri" w:cs="Calibri" w:eastAsia="Calibri" w:hAnsi="Calibri"/>
         </w:rPr>
-        <w:t xml:space="preserve">In the app: the Journeys report dataset, then the customer page, then save-as-template.</w:t>
+        <w:t xml:space="preserve">In the app: a dark-theme pass over the customer page, the Journeys report and Save as Template; a platform catalogue of shared starters if workspaces are to share them.</w:t>
       </w:r>
     </w:p>
     <w:p>

</xml_diff>

<commit_message>
Journeys set-up guide: the build script's escapes, and the rebuilt document
Co-Authored-By: Claude Fable 5.1 <noreply@anthropic.com>
</commit_message>
<xml_diff>
--- a/docs/guides/CEP_Journeys_Setup_Guide.docx
+++ b/docs/guides/CEP_Journeys_Setup_Guide.docx
@@ -54,7 +54,7 @@
           <w:sz w:val="20"/>
           <w:szCs w:val="20"/>
         </w:rPr>
-        <w:t xml:space="preserve">Built 2026-10-09 from the CEP code and manuals at main (PRs #98 to #106, database patches 0045 and 0046). Screenshots are from the app's design playgrounds with sample data.</w:t>
+        <w:t xml:space="preserve">Built 2026-10-09 from the CEP code and manuals at main (PRs #98 to #110, database patches 0045 and 0046). Screenshots are from the app's design playgrounds with sample data, in the light theme; the app also offers a dark theme under the account menu's Appearance.</w:t>
       </w:r>
     </w:p>
     <w:p>
@@ -6598,6 +6598,98 @@
                 <w:szCs w:val="19"/>
               </w:rPr>
               <w:t xml:space="preserve"> template for every message a journey sends. A draft template fails the readiness check.</w:t>
+            </w:r>
+          </w:p>
+        </w:tc>
+      </w:tr>
+      <w:tr>
+        <w:tc>
+          <w:tcPr>
+            <w:tcW w:type="dxa" w:w="1337"/>
+            <w:tcBorders>
+              <w:top w:val="single" w:color="C9CDD8" w:sz="4"/>
+              <w:left w:val="single" w:color="C9CDD8" w:sz="4"/>
+              <w:bottom w:val="single" w:color="C9CDD8" w:sz="4"/>
+              <w:right w:val="single" w:color="C9CDD8" w:sz="4"/>
+            </w:tcBorders>
+            <w:tcMar>
+              <w:top w:type="dxa" w:w="60"/>
+              <w:left w:type="dxa" w:w="100"/>
+              <w:bottom w:type="dxa" w:w="60"/>
+              <w:right w:type="dxa" w:w="100"/>
+            </w:tcMar>
+          </w:tcPr>
+          <w:p>
+            <w:pPr>
+              <w:spacing w:after="0"/>
+            </w:pPr>
+            <w:r>
+              <w:rPr>
+                <w:rFonts w:ascii="Calibri" w:cs="Calibri" w:eastAsia="Calibri" w:hAnsi="Calibri"/>
+                <w:sz w:val="19"/>
+                <w:szCs w:val="19"/>
+              </w:rPr>
+              <w:t xml:space="preserve">Senders</w:t>
+            </w:r>
+          </w:p>
+        </w:tc>
+        <w:tc>
+          <w:tcPr>
+            <w:tcW w:type="dxa" w:w="2674"/>
+            <w:tcBorders>
+              <w:top w:val="single" w:color="C9CDD8" w:sz="4"/>
+              <w:left w:val="single" w:color="C9CDD8" w:sz="4"/>
+              <w:bottom w:val="single" w:color="C9CDD8" w:sz="4"/>
+              <w:right w:val="single" w:color="C9CDD8" w:sz="4"/>
+            </w:tcBorders>
+            <w:tcMar>
+              <w:top w:type="dxa" w:w="60"/>
+              <w:left w:type="dxa" w:w="100"/>
+              <w:bottom w:type="dxa" w:w="60"/>
+              <w:right w:type="dxa" w:w="100"/>
+            </w:tcMar>
+          </w:tcPr>
+          <w:p>
+            <w:pPr>
+              <w:spacing w:after="0"/>
+            </w:pPr>
+            <w:r>
+              <w:rPr>
+                <w:rFonts w:ascii="Calibri" w:cs="Calibri" w:eastAsia="Calibri" w:hAnsi="Calibri"/>
+                <w:sz w:val="19"/>
+                <w:szCs w:val="19"/>
+              </w:rPr>
+              <w:t xml:space="preserve">Settings → Sending Engines</w:t>
+            </w:r>
+          </w:p>
+        </w:tc>
+        <w:tc>
+          <w:tcPr>
+            <w:tcW w:type="dxa" w:w="5349"/>
+            <w:tcBorders>
+              <w:top w:val="single" w:color="C9CDD8" w:sz="4"/>
+              <w:left w:val="single" w:color="C9CDD8" w:sz="4"/>
+              <w:bottom w:val="single" w:color="C9CDD8" w:sz="4"/>
+              <w:right w:val="single" w:color="C9CDD8" w:sz="4"/>
+            </w:tcBorders>
+            <w:tcMar>
+              <w:top w:type="dxa" w:w="60"/>
+              <w:left w:type="dxa" w:w="100"/>
+              <w:bottom w:type="dxa" w:w="60"/>
+              <w:right w:type="dxa" w:w="100"/>
+            </w:tcMar>
+          </w:tcPr>
+          <w:p>
+            <w:pPr>
+              <w:spacing w:after="0"/>
+            </w:pPr>
+            <w:r>
+              <w:rPr>
+                <w:rFonts w:ascii="Calibri" w:cs="Calibri" w:eastAsia="Calibri" w:hAnsi="Calibri"/>
+                <w:sz w:val="19"/>
+                <w:szCs w:val="19"/>
+              </w:rPr>
+              <w:t xml:space="preserve">The senders a message step may pick from; the engine's default sender is used when a step names none.</w:t>
             </w:r>
           </w:p>
         </w:tc>
@@ -8662,7 +8754,59 @@
         <w:rPr>
           <w:rFonts w:ascii="Calibri" w:cs="Calibri" w:eastAsia="Calibri" w:hAnsi="Calibri"/>
         </w:rPr>
-        <w:t xml:space="preserve"> on a journey's page makes a new draft copy, steps included, to start again or try a variant. Saving a journey as a reusable template is not offered (Chapter 12).</w:t>
+        <w:t xml:space="preserve"> on a journey's page makes a new draft copy, steps included, to start again or try a variant.</w:t>
+      </w:r>
+    </w:p>
+    <w:p>
+      <w:pPr>
+        <w:pStyle w:val="ListParagraph"/>
+        <w:numPr>
+          <w:ilvl w:val="0"/>
+          <w:numId w:val="2"/>
+        </w:numPr>
+        <w:spacing w:after="60"/>
+      </w:pPr>
+      <w:r>
+        <w:rPr>
+          <w:rFonts w:ascii="Calibri" w:cs="Calibri" w:eastAsia="Calibri" w:hAnsi="Calibri"/>
+          <w:b/>
+          <w:bCs/>
+        </w:rPr>
+        <w:t xml:space="preserve">Save as Template</w:t>
+      </w:r>
+      <w:r>
+        <w:rPr>
+          <w:rFonts w:ascii="Calibri" w:cs="Calibri" w:eastAsia="Calibri" w:hAnsi="Calibri"/>
+        </w:rPr>
+        <w:t xml:space="preserve"> on a journey's page keeps the live version (or the newest, on a draft) as a template of the workspace, with a name, a category and a description. Saved templates sit under </w:t>
+      </w:r>
+      <w:r>
+        <w:rPr>
+          <w:rFonts w:ascii="Calibri" w:cs="Calibri" w:eastAsia="Calibri" w:hAnsi="Calibri"/>
+          <w:b/>
+          <w:bCs/>
+        </w:rPr>
+        <w:t xml:space="preserve">Your Templates</w:t>
+      </w:r>
+      <w:r>
+        <w:rPr>
+          <w:rFonts w:ascii="Calibri" w:cs="Calibri" w:eastAsia="Calibri" w:hAnsi="Calibri"/>
+        </w:rPr>
+        <w:t xml:space="preserve"> on the Journey Templates panel and in View More, tagged </w:t>
+      </w:r>
+      <w:r>
+        <w:rPr>
+          <w:rFonts w:ascii="Calibri" w:cs="Calibri" w:eastAsia="Calibri" w:hAnsi="Calibri"/>
+          <w:i/>
+          <w:iCs/>
+        </w:rPr>
+        <w:t xml:space="preserve">Saved Template</w:t>
+      </w:r>
+      <w:r>
+        <w:rPr>
+          <w:rFonts w:ascii="Calibri" w:cs="Calibri" w:eastAsia="Calibri" w:hAnsi="Calibri"/>
+        </w:rPr>
+        <w:t xml:space="preserve">; they are previewed, used and deleted like a starter, and never change after they are saved.</w:t>
       </w:r>
     </w:p>
     <w:p>
@@ -11311,7 +11455,35 @@
         <w:rPr>
           <w:rFonts w:ascii="Calibri" w:cs="Calibri" w:eastAsia="Calibri" w:hAnsi="Calibri"/>
         </w:rPr>
-        <w:t xml:space="preserve"> template through the normal send engine, as a generated campaign of its own (one per step per day), so consent, suppressions, the preference centre, frequency caps and quiet hours apply exactly as to a campaign. A held-back message is recorded on the customer's timeline with its reason. The step's template is chosen in the panel; the sender is the engine's default sender.</w:t>
+        <w:t xml:space="preserve"> template through the normal send engine, as a generated campaign of its own (one per step per day), so consent, suppressions, the preference centre, frequency caps and quiet hours apply exactly as to a campaign. A held-back message is recorded on the customer's timeline with its reason. The step's template and its </w:t>
+      </w:r>
+      <w:r>
+        <w:rPr>
+          <w:rFonts w:ascii="Calibri" w:cs="Calibri" w:eastAsia="Calibri" w:hAnsi="Calibri"/>
+          <w:b/>
+          <w:bCs/>
+        </w:rPr>
+        <w:t xml:space="preserve">Sender</w:t>
+      </w:r>
+      <w:r>
+        <w:rPr>
+          <w:rFonts w:ascii="Calibri" w:cs="Calibri" w:eastAsia="Calibri" w:hAnsi="Calibri"/>
+        </w:rPr>
+        <w:t xml:space="preserve"> are chosen in the panel; left as </w:t>
+      </w:r>
+      <w:r>
+        <w:rPr>
+          <w:rFonts w:ascii="Calibri" w:cs="Calibri" w:eastAsia="Calibri" w:hAnsi="Calibri"/>
+          <w:i/>
+          <w:iCs/>
+        </w:rPr>
+        <w:t xml:space="preserve">Workspace default</w:t>
+      </w:r>
+      <w:r>
+        <w:rPr>
+          <w:rFonts w:ascii="Calibri" w:cs="Calibri" w:eastAsia="Calibri" w:hAnsi="Calibri"/>
+        </w:rPr>
+        <w:t xml:space="preserve">, the message goes from the engine's default sender for the channel, and an SMS step offers texting senders only.</w:t>
       </w:r>
     </w:p>
     <w:p>
@@ -13505,7 +13677,23 @@
                 <w:sz w:val="19"/>
                 <w:szCs w:val="19"/>
               </w:rPr>
-              <w:t xml:space="preserve">Everyone who entered, newest first, where they are now; search by name or email, filter by status, Export CSV (</w:t>
+              <w:t xml:space="preserve">Everyone who entered, newest first, where they are now; search by name or email, filter by status and, once a step has held anyone back, by </w:t>
+            </w:r>
+            <w:r>
+              <w:rPr>
+                <w:rFonts w:ascii="Calibri" w:cs="Calibri" w:eastAsia="Calibri" w:hAnsi="Calibri"/>
+                <w:sz w:val="19"/>
+                <w:szCs w:val="19"/>
+              </w:rPr>
+              <w:t xml:space="preserve">Held Back Reason</w:t>
+            </w:r>
+            <w:r>
+              <w:rPr>
+                <w:rFonts w:ascii="Calibri" w:cs="Calibri" w:eastAsia="Calibri" w:hAnsi="Calibri"/>
+                <w:sz w:val="19"/>
+                <w:szCs w:val="19"/>
+              </w:rPr>
+              <w:t xml:space="preserve"> with how many customers each; Export CSV (</w:t>
             </w:r>
             <w:r>
               <w:rPr>
@@ -13521,7 +13709,7 @@
                 <w:sz w:val="19"/>
                 <w:szCs w:val="19"/>
               </w:rPr>
-              <w:t xml:space="preserve">).</w:t>
+              <w:t xml:space="preserve">) follows the filters.</w:t>
             </w:r>
           </w:p>
         </w:tc>
@@ -13613,7 +13801,23 @@
                 <w:sz w:val="19"/>
                 <w:szCs w:val="19"/>
               </w:rPr>
-              <w:t xml:space="preserve">Entry, every step with its outcome and time, a held-back message's reason, a Condition's answer, the Goal, where they wait now, how they left.</w:t>
+              <w:t xml:space="preserve">Entry, every step with its outcome and time, a held-back message's reason, a Condition's answer, the Goal, where they wait now, how they left. </w:t>
+            </w:r>
+            <w:r>
+              <w:rPr>
+                <w:rFonts w:ascii="Calibri" w:cs="Calibri" w:eastAsia="Calibri" w:hAnsi="Calibri"/>
+                <w:sz w:val="19"/>
+                <w:szCs w:val="19"/>
+              </w:rPr>
+              <w:t xml:space="preserve">View Customer Record</w:t>
+            </w:r>
+            <w:r>
+              <w:rPr>
+                <w:rFonts w:ascii="Calibri" w:cs="Calibri" w:eastAsia="Calibri" w:hAnsi="Calibri"/>
+                <w:sz w:val="19"/>
+                <w:szCs w:val="19"/>
+              </w:rPr>
+              <w:t xml:space="preserve"> opens the customer's page.</w:t>
             </w:r>
           </w:p>
         </w:tc>
@@ -13645,7 +13849,7 @@
                 <w:sz w:val="19"/>
                 <w:szCs w:val="19"/>
               </w:rPr>
-              <w:t xml:space="preserve">Webhook Calls card</w:t>
+              <w:t xml:space="preserve">Customer page</w:t>
             </w:r>
           </w:p>
         </w:tc>
@@ -13675,7 +13879,7 @@
                 <w:sz w:val="19"/>
                 <w:szCs w:val="19"/>
               </w:rPr>
-              <w:t xml:space="preserve">Calls</w:t>
+              <w:t xml:space="preserve">One customer, every journey</w:t>
             </w:r>
           </w:p>
         </w:tc>
@@ -13705,7 +13909,7 @@
                 <w:sz w:val="19"/>
                 <w:szCs w:val="19"/>
               </w:rPr>
-              <w:t xml:space="preserve">Every call a Webhook step made, test calls included: the endpoint's answer, the try, the duration.</w:t>
+              <w:t xml:space="preserve">Contact Lists → Find a Customer, or the link from a timeline: the record, consent per channel, custom attributes, every journey entered with a link to each timeline, events, orders, messages and lists, in one place.</w:t>
             </w:r>
           </w:p>
         </w:tc>
@@ -13737,7 +13941,7 @@
                 <w:sz w:val="19"/>
                 <w:szCs w:val="19"/>
               </w:rPr>
-              <w:t xml:space="preserve">Generated Campaigns</w:t>
+              <w:t xml:space="preserve">Webhook Calls card</w:t>
             </w:r>
           </w:p>
         </w:tc>
@@ -13767,7 +13971,7 @@
                 <w:sz w:val="19"/>
                 <w:szCs w:val="19"/>
               </w:rPr>
-              <w:t xml:space="preserve">Per step per day</w:t>
+              <w:t xml:space="preserve">Calls</w:t>
             </w:r>
           </w:p>
         </w:tc>
@@ -13797,7 +14001,7 @@
                 <w:sz w:val="19"/>
                 <w:szCs w:val="19"/>
               </w:rPr>
-              <w:t xml:space="preserve">Each message step sends through a campaign; open one for its recipients and results, the same as any campaign.</w:t>
+              <w:t xml:space="preserve">Every call a Webhook step made, test calls included: the endpoint's answer, the try, the duration.</w:t>
             </w:r>
           </w:p>
         </w:tc>
@@ -13829,6 +14033,190 @@
                 <w:sz w:val="19"/>
                 <w:szCs w:val="19"/>
               </w:rPr>
+              <w:t xml:space="preserve">Generated Campaigns</w:t>
+            </w:r>
+          </w:p>
+        </w:tc>
+        <w:tc>
+          <w:tcPr>
+            <w:tcW w:type="dxa" w:w="2340"/>
+            <w:tcBorders>
+              <w:top w:val="single" w:color="C9CDD8" w:sz="4"/>
+              <w:left w:val="single" w:color="C9CDD8" w:sz="4"/>
+              <w:bottom w:val="single" w:color="C9CDD8" w:sz="4"/>
+              <w:right w:val="single" w:color="C9CDD8" w:sz="4"/>
+            </w:tcBorders>
+            <w:tcMar>
+              <w:top w:type="dxa" w:w="60"/>
+              <w:left w:type="dxa" w:w="100"/>
+              <w:bottom w:type="dxa" w:w="60"/>
+              <w:right w:type="dxa" w:w="100"/>
+            </w:tcMar>
+          </w:tcPr>
+          <w:p>
+            <w:pPr>
+              <w:spacing w:after="0"/>
+            </w:pPr>
+            <w:r>
+              <w:rPr>
+                <w:rFonts w:ascii="Calibri" w:cs="Calibri" w:eastAsia="Calibri" w:hAnsi="Calibri"/>
+                <w:sz w:val="19"/>
+                <w:szCs w:val="19"/>
+              </w:rPr>
+              <w:t xml:space="preserve">Per step per day</w:t>
+            </w:r>
+          </w:p>
+        </w:tc>
+        <w:tc>
+          <w:tcPr>
+            <w:tcW w:type="dxa" w:w="4680"/>
+            <w:tcBorders>
+              <w:top w:val="single" w:color="C9CDD8" w:sz="4"/>
+              <w:left w:val="single" w:color="C9CDD8" w:sz="4"/>
+              <w:bottom w:val="single" w:color="C9CDD8" w:sz="4"/>
+              <w:right w:val="single" w:color="C9CDD8" w:sz="4"/>
+            </w:tcBorders>
+            <w:tcMar>
+              <w:top w:type="dxa" w:w="60"/>
+              <w:left w:type="dxa" w:w="100"/>
+              <w:bottom w:type="dxa" w:w="60"/>
+              <w:right w:type="dxa" w:w="100"/>
+            </w:tcMar>
+          </w:tcPr>
+          <w:p>
+            <w:pPr>
+              <w:spacing w:after="0"/>
+            </w:pPr>
+            <w:r>
+              <w:rPr>
+                <w:rFonts w:ascii="Calibri" w:cs="Calibri" w:eastAsia="Calibri" w:hAnsi="Calibri"/>
+                <w:sz w:val="19"/>
+                <w:szCs w:val="19"/>
+              </w:rPr>
+              <w:t xml:space="preserve">Each message step sends through a campaign; open one for its recipients and results, the same as any campaign.</w:t>
+            </w:r>
+          </w:p>
+        </w:tc>
+      </w:tr>
+      <w:tr>
+        <w:tc>
+          <w:tcPr>
+            <w:tcW w:type="dxa" w:w="2340"/>
+            <w:tcBorders>
+              <w:top w:val="single" w:color="C9CDD8" w:sz="4"/>
+              <w:left w:val="single" w:color="C9CDD8" w:sz="4"/>
+              <w:bottom w:val="single" w:color="C9CDD8" w:sz="4"/>
+              <w:right w:val="single" w:color="C9CDD8" w:sz="4"/>
+            </w:tcBorders>
+            <w:tcMar>
+              <w:top w:type="dxa" w:w="60"/>
+              <w:left w:type="dxa" w:w="100"/>
+              <w:bottom w:type="dxa" w:w="60"/>
+              <w:right w:type="dxa" w:w="100"/>
+            </w:tcMar>
+          </w:tcPr>
+          <w:p>
+            <w:pPr>
+              <w:spacing w:after="0"/>
+            </w:pPr>
+            <w:r>
+              <w:rPr>
+                <w:rFonts w:ascii="Calibri" w:cs="Calibri" w:eastAsia="Calibri" w:hAnsi="Calibri"/>
+                <w:sz w:val="19"/>
+                <w:szCs w:val="19"/>
+              </w:rPr>
+              <w:t xml:space="preserve">Reports → Journeys dataset</w:t>
+            </w:r>
+          </w:p>
+        </w:tc>
+        <w:tc>
+          <w:tcPr>
+            <w:tcW w:type="dxa" w:w="2340"/>
+            <w:tcBorders>
+              <w:top w:val="single" w:color="C9CDD8" w:sz="4"/>
+              <w:left w:val="single" w:color="C9CDD8" w:sz="4"/>
+              <w:bottom w:val="single" w:color="C9CDD8" w:sz="4"/>
+              <w:right w:val="single" w:color="C9CDD8" w:sz="4"/>
+            </w:tcBorders>
+            <w:tcMar>
+              <w:top w:type="dxa" w:w="60"/>
+              <w:left w:type="dxa" w:w="100"/>
+              <w:bottom w:type="dxa" w:w="60"/>
+              <w:right w:type="dxa" w:w="100"/>
+            </w:tcMar>
+          </w:tcPr>
+          <w:p>
+            <w:pPr>
+              <w:spacing w:after="0"/>
+            </w:pPr>
+            <w:r>
+              <w:rPr>
+                <w:rFonts w:ascii="Calibri" w:cs="Calibri" w:eastAsia="Calibri" w:hAnsi="Calibri"/>
+                <w:sz w:val="19"/>
+                <w:szCs w:val="19"/>
+              </w:rPr>
+              <w:t xml:space="preserve">Per journey per day</w:t>
+            </w:r>
+          </w:p>
+        </w:tc>
+        <w:tc>
+          <w:tcPr>
+            <w:tcW w:type="dxa" w:w="4680"/>
+            <w:tcBorders>
+              <w:top w:val="single" w:color="C9CDD8" w:sz="4"/>
+              <w:left w:val="single" w:color="C9CDD8" w:sz="4"/>
+              <w:bottom w:val="single" w:color="C9CDD8" w:sz="4"/>
+              <w:right w:val="single" w:color="C9CDD8" w:sz="4"/>
+            </w:tcBorders>
+            <w:tcMar>
+              <w:top w:type="dxa" w:w="60"/>
+              <w:left w:type="dxa" w:w="100"/>
+              <w:bottom w:type="dxa" w:w="60"/>
+              <w:right w:type="dxa" w:w="100"/>
+            </w:tcMar>
+          </w:tcPr>
+          <w:p>
+            <w:pPr>
+              <w:spacing w:after="0"/>
+            </w:pPr>
+            <w:r>
+              <w:rPr>
+                <w:rFonts w:ascii="Calibri" w:cs="Calibri" w:eastAsia="Calibri" w:hAnsi="Calibri"/>
+                <w:sz w:val="19"/>
+                <w:szCs w:val="19"/>
+              </w:rPr>
+              <w:t xml:space="preserve">Entered, converted with revenue, sent, delivered, opened, clicked, held back and failed over a period, with a journey filter, the day curve, a row per journey and a CSV of every journey's every day.</w:t>
+            </w:r>
+          </w:p>
+        </w:tc>
+      </w:tr>
+      <w:tr>
+        <w:tc>
+          <w:tcPr>
+            <w:tcW w:type="dxa" w:w="2340"/>
+            <w:tcBorders>
+              <w:top w:val="single" w:color="C9CDD8" w:sz="4"/>
+              <w:left w:val="single" w:color="C9CDD8" w:sz="4"/>
+              <w:bottom w:val="single" w:color="C9CDD8" w:sz="4"/>
+              <w:right w:val="single" w:color="C9CDD8" w:sz="4"/>
+            </w:tcBorders>
+            <w:tcMar>
+              <w:top w:type="dxa" w:w="60"/>
+              <w:left w:type="dxa" w:w="100"/>
+              <w:bottom w:type="dxa" w:w="60"/>
+              <w:right w:type="dxa" w:w="100"/>
+            </w:tcMar>
+          </w:tcPr>
+          <w:p>
+            <w:pPr>
+              <w:spacing w:after="0"/>
+            </w:pPr>
+            <w:r>
+              <w:rPr>
+                <w:rFonts w:ascii="Calibri" w:cs="Calibri" w:eastAsia="Calibri" w:hAnsi="Calibri"/>
+                <w:sz w:val="19"/>
+                <w:szCs w:val="19"/>
+              </w:rPr>
               <w:t xml:space="preserve">Nightly roll-up</w:t>
             </w:r>
           </w:p>
@@ -13889,7 +14277,7 @@
                 <w:sz w:val="19"/>
                 <w:szCs w:val="19"/>
               </w:rPr>
-              <w:t xml:space="preserve">Enrolments, conversions, revenue and message counts per journey per day, for reporting. Lags the live page by up to a day.</w:t>
+              <w:t xml:space="preserve">Enrolments, conversions, revenue and message counts per journey, for the Performance card. Lags the live page by up to a day.</w:t>
             </w:r>
           </w:p>
         </w:tc>
@@ -14156,7 +14544,7 @@
         <w:rPr>
           <w:rFonts w:ascii="Calibri" w:cs="Calibri" w:eastAsia="Calibri" w:hAnsi="Calibri"/>
         </w:rPr>
-        <w:t xml:space="preserve">: consent, suppressions, a frequency cap or quiet hours; the timeline says which. Governance applies to journeys as it does to campaigns.</w:t>
+        <w:t xml:space="preserve">: consent, suppressions, a frequency cap or quiet hours; the Customers card's Held Back Reason filter lists the customers behind each reason, and the timeline says which for one customer. Governance applies to journeys as it does to campaigns.</w:t>
       </w:r>
     </w:p>
     <w:p>
@@ -19851,7 +20239,331 @@
                 <w:sz w:val="19"/>
                 <w:szCs w:val="19"/>
               </w:rPr>
-              <w:t xml:space="preserve">Everything the app does: condition-fields, condition-count, preview-customers, customers (+ export, timeline, retry, skip), versions/{n}/counts and preview, suppressions, attention, webhook-test, webhook-calls.</w:t>
+              <w:t xml:space="preserve">Everything the app does: condition-fields, condition-count, preview-customers, customers (+ export, reasons, timeline, retry, skip), versions/{n}/counts and preview, suppressions, attention, webhook-test, webhook-calls.</w:t>
+            </w:r>
+          </w:p>
+        </w:tc>
+      </w:tr>
+      <w:tr>
+        <w:tc>
+          <w:tcPr>
+            <w:tcW w:type="dxa" w:w="3510"/>
+            <w:tcBorders>
+              <w:top w:val="single" w:color="C9CDD8" w:sz="4"/>
+              <w:left w:val="single" w:color="C9CDD8" w:sz="4"/>
+              <w:bottom w:val="single" w:color="C9CDD8" w:sz="4"/>
+              <w:right w:val="single" w:color="C9CDD8" w:sz="4"/>
+            </w:tcBorders>
+            <w:tcMar>
+              <w:top w:type="dxa" w:w="60"/>
+              <w:left w:type="dxa" w:w="100"/>
+              <w:bottom w:type="dxa" w:w="60"/>
+              <w:right w:type="dxa" w:w="100"/>
+            </w:tcMar>
+          </w:tcPr>
+          <w:p>
+            <w:pPr>
+              <w:spacing w:after="0"/>
+            </w:pPr>
+            <w:r>
+              <w:rPr>
+                <w:rFonts w:ascii="Consolas" w:cs="Consolas" w:eastAsia="Consolas" w:hAnsi="Consolas"/>
+                <w:sz w:val="19"/>
+                <w:szCs w:val="19"/>
+              </w:rPr>
+              <w:t xml:space="preserve">/api/v1/journey-templates/</w:t>
+            </w:r>
+          </w:p>
+        </w:tc>
+        <w:tc>
+          <w:tcPr>
+            <w:tcW w:type="dxa" w:w="2340"/>
+            <w:tcBorders>
+              <w:top w:val="single" w:color="C9CDD8" w:sz="4"/>
+              <w:left w:val="single" w:color="C9CDD8" w:sz="4"/>
+              <w:bottom w:val="single" w:color="C9CDD8" w:sz="4"/>
+              <w:right w:val="single" w:color="C9CDD8" w:sz="4"/>
+            </w:tcBorders>
+            <w:tcMar>
+              <w:top w:type="dxa" w:w="60"/>
+              <w:left w:type="dxa" w:w="100"/>
+              <w:bottom w:type="dxa" w:w="60"/>
+              <w:right w:type="dxa" w:w="100"/>
+            </w:tcMar>
+          </w:tcPr>
+          <w:p>
+            <w:pPr>
+              <w:spacing w:after="0"/>
+            </w:pPr>
+            <w:r>
+              <w:rPr>
+                <w:rFonts w:ascii="Calibri" w:cs="Calibri" w:eastAsia="Calibri" w:hAnsi="Calibri"/>
+                <w:sz w:val="19"/>
+                <w:szCs w:val="19"/>
+              </w:rPr>
+              <w:t xml:space="preserve">a user session with </w:t>
+            </w:r>
+            <w:r>
+              <w:rPr>
+                <w:rFonts w:ascii="Consolas" w:cs="Consolas" w:eastAsia="Consolas" w:hAnsi="Consolas"/>
+                <w:sz w:val="19"/>
+                <w:szCs w:val="19"/>
+              </w:rPr>
+              <w:t xml:space="preserve">journey.edit</w:t>
+            </w:r>
+          </w:p>
+        </w:tc>
+        <w:tc>
+          <w:tcPr>
+            <w:tcW w:type="dxa" w:w="3510"/>
+            <w:tcBorders>
+              <w:top w:val="single" w:color="C9CDD8" w:sz="4"/>
+              <w:left w:val="single" w:color="C9CDD8" w:sz="4"/>
+              <w:bottom w:val="single" w:color="C9CDD8" w:sz="4"/>
+              <w:right w:val="single" w:color="C9CDD8" w:sz="4"/>
+            </w:tcBorders>
+            <w:tcMar>
+              <w:top w:type="dxa" w:w="60"/>
+              <w:left w:type="dxa" w:w="100"/>
+              <w:bottom w:type="dxa" w:w="60"/>
+              <w:right w:type="dxa" w:w="100"/>
+            </w:tcMar>
+          </w:tcPr>
+          <w:p>
+            <w:pPr>
+              <w:spacing w:after="0"/>
+            </w:pPr>
+            <w:r>
+              <w:rPr>
+                <w:rFonts w:ascii="Calibri" w:cs="Calibri" w:eastAsia="Calibri" w:hAnsi="Calibri"/>
+                <w:sz w:val="19"/>
+                <w:szCs w:val="19"/>
+              </w:rPr>
+              <w:t xml:space="preserve">The workspace's saved templates: list, save (a journey and a version number), rename, delete.</w:t>
+            </w:r>
+          </w:p>
+        </w:tc>
+      </w:tr>
+      <w:tr>
+        <w:tc>
+          <w:tcPr>
+            <w:tcW w:type="dxa" w:w="3510"/>
+            <w:tcBorders>
+              <w:top w:val="single" w:color="C9CDD8" w:sz="4"/>
+              <w:left w:val="single" w:color="C9CDD8" w:sz="4"/>
+              <w:bottom w:val="single" w:color="C9CDD8" w:sz="4"/>
+              <w:right w:val="single" w:color="C9CDD8" w:sz="4"/>
+            </w:tcBorders>
+            <w:tcMar>
+              <w:top w:type="dxa" w:w="60"/>
+              <w:left w:type="dxa" w:w="100"/>
+              <w:bottom w:type="dxa" w:w="60"/>
+              <w:right w:type="dxa" w:w="100"/>
+            </w:tcMar>
+          </w:tcPr>
+          <w:p>
+            <w:pPr>
+              <w:spacing w:after="0"/>
+            </w:pPr>
+            <w:r>
+              <w:rPr>
+                <w:rFonts w:ascii="Consolas" w:cs="Consolas" w:eastAsia="Consolas" w:hAnsi="Consolas"/>
+                <w:sz w:val="19"/>
+                <w:szCs w:val="19"/>
+              </w:rPr>
+              <w:t xml:space="preserve">GET /api/v1/customers/?q=</w:t>
+            </w:r>
+            <w:r>
+              <w:rPr>
+                <w:rFonts w:ascii="Calibri" w:cs="Calibri" w:eastAsia="Calibri" w:hAnsi="Calibri"/>
+                <w:sz w:val="19"/>
+                <w:szCs w:val="19"/>
+              </w:rPr>
+              <w:t xml:space="preserve">, </w:t>
+            </w:r>
+            <w:r>
+              <w:rPr>
+                <w:rFonts w:ascii="Consolas" w:cs="Consolas" w:eastAsia="Consolas" w:hAnsi="Consolas"/>
+                <w:sz w:val="19"/>
+                <w:szCs w:val="19"/>
+              </w:rPr>
+              <w:t xml:space="preserve">GET /api/v1/customers/{party_id}/</w:t>
+            </w:r>
+          </w:p>
+        </w:tc>
+        <w:tc>
+          <w:tcPr>
+            <w:tcW w:type="dxa" w:w="2340"/>
+            <w:tcBorders>
+              <w:top w:val="single" w:color="C9CDD8" w:sz="4"/>
+              <w:left w:val="single" w:color="C9CDD8" w:sz="4"/>
+              <w:bottom w:val="single" w:color="C9CDD8" w:sz="4"/>
+              <w:right w:val="single" w:color="C9CDD8" w:sz="4"/>
+            </w:tcBorders>
+            <w:tcMar>
+              <w:top w:type="dxa" w:w="60"/>
+              <w:left w:type="dxa" w:w="100"/>
+              <w:bottom w:type="dxa" w:w="60"/>
+              <w:right w:type="dxa" w:w="100"/>
+            </w:tcMar>
+          </w:tcPr>
+          <w:p>
+            <w:pPr>
+              <w:spacing w:after="0"/>
+            </w:pPr>
+            <w:r>
+              <w:rPr>
+                <w:rFonts w:ascii="Calibri" w:cs="Calibri" w:eastAsia="Calibri" w:hAnsi="Calibri"/>
+                <w:sz w:val="19"/>
+                <w:szCs w:val="19"/>
+              </w:rPr>
+              <w:t xml:space="preserve">a user session that may see lists, campaigns or journeys</w:t>
+            </w:r>
+          </w:p>
+        </w:tc>
+        <w:tc>
+          <w:tcPr>
+            <w:tcW w:type="dxa" w:w="3510"/>
+            <w:tcBorders>
+              <w:top w:val="single" w:color="C9CDD8" w:sz="4"/>
+              <w:left w:val="single" w:color="C9CDD8" w:sz="4"/>
+              <w:bottom w:val="single" w:color="C9CDD8" w:sz="4"/>
+              <w:right w:val="single" w:color="C9CDD8" w:sz="4"/>
+            </w:tcBorders>
+            <w:tcMar>
+              <w:top w:type="dxa" w:w="60"/>
+              <w:left w:type="dxa" w:w="100"/>
+              <w:bottom w:type="dxa" w:w="60"/>
+              <w:right w:type="dxa" w:w="100"/>
+            </w:tcMar>
+          </w:tcPr>
+          <w:p>
+            <w:pPr>
+              <w:spacing w:after="0"/>
+            </w:pPr>
+            <w:r>
+              <w:rPr>
+                <w:rFonts w:ascii="Calibri" w:cs="Calibri" w:eastAsia="Calibri" w:hAnsi="Calibri"/>
+                <w:sz w:val="19"/>
+                <w:szCs w:val="19"/>
+              </w:rPr>
+              <w:t xml:space="preserve">The customer search and the customer page.</w:t>
+            </w:r>
+          </w:p>
+        </w:tc>
+      </w:tr>
+      <w:tr>
+        <w:tc>
+          <w:tcPr>
+            <w:tcW w:type="dxa" w:w="3510"/>
+            <w:tcBorders>
+              <w:top w:val="single" w:color="C9CDD8" w:sz="4"/>
+              <w:left w:val="single" w:color="C9CDD8" w:sz="4"/>
+              <w:bottom w:val="single" w:color="C9CDD8" w:sz="4"/>
+              <w:right w:val="single" w:color="C9CDD8" w:sz="4"/>
+            </w:tcBorders>
+            <w:tcMar>
+              <w:top w:type="dxa" w:w="60"/>
+              <w:left w:type="dxa" w:w="100"/>
+              <w:bottom w:type="dxa" w:w="60"/>
+              <w:right w:type="dxa" w:w="100"/>
+            </w:tcMar>
+          </w:tcPr>
+          <w:p>
+            <w:pPr>
+              <w:spacing w:after="0"/>
+            </w:pPr>
+            <w:r>
+              <w:rPr>
+                <w:rFonts w:ascii="Consolas" w:cs="Consolas" w:eastAsia="Consolas" w:hAnsi="Consolas"/>
+                <w:sz w:val="19"/>
+                <w:szCs w:val="19"/>
+              </w:rPr>
+              <w:t xml:space="preserve">GET /api/v1/reports/journeys/</w:t>
+            </w:r>
+            <w:r>
+              <w:rPr>
+                <w:rFonts w:ascii="Calibri" w:cs="Calibri" w:eastAsia="Calibri" w:hAnsi="Calibri"/>
+                <w:sz w:val="19"/>
+                <w:szCs w:val="19"/>
+              </w:rPr>
+              <w:t xml:space="preserve">, </w:t>
+            </w:r>
+            <w:r>
+              <w:rPr>
+                <w:rFonts w:ascii="Consolas" w:cs="Consolas" w:eastAsia="Consolas" w:hAnsi="Consolas"/>
+                <w:sz w:val="19"/>
+                <w:szCs w:val="19"/>
+              </w:rPr>
+              <w:t xml:space="preserve">/reports/journeys.csv</w:t>
+            </w:r>
+          </w:p>
+        </w:tc>
+        <w:tc>
+          <w:tcPr>
+            <w:tcW w:type="dxa" w:w="2340"/>
+            <w:tcBorders>
+              <w:top w:val="single" w:color="C9CDD8" w:sz="4"/>
+              <w:left w:val="single" w:color="C9CDD8" w:sz="4"/>
+              <w:bottom w:val="single" w:color="C9CDD8" w:sz="4"/>
+              <w:right w:val="single" w:color="C9CDD8" w:sz="4"/>
+            </w:tcBorders>
+            <w:tcMar>
+              <w:top w:type="dxa" w:w="60"/>
+              <w:left w:type="dxa" w:w="100"/>
+              <w:bottom w:type="dxa" w:w="60"/>
+              <w:right w:type="dxa" w:w="100"/>
+            </w:tcMar>
+          </w:tcPr>
+          <w:p>
+            <w:pPr>
+              <w:spacing w:after="0"/>
+            </w:pPr>
+            <w:r>
+              <w:rPr>
+                <w:rFonts w:ascii="Calibri" w:cs="Calibri" w:eastAsia="Calibri" w:hAnsi="Calibri"/>
+                <w:sz w:val="19"/>
+                <w:szCs w:val="19"/>
+              </w:rPr>
+              <w:t xml:space="preserve">a user session with </w:t>
+            </w:r>
+            <w:r>
+              <w:rPr>
+                <w:rFonts w:ascii="Consolas" w:cs="Consolas" w:eastAsia="Consolas" w:hAnsi="Consolas"/>
+                <w:sz w:val="19"/>
+                <w:szCs w:val="19"/>
+              </w:rPr>
+              <w:t xml:space="preserve">report.view</w:t>
+            </w:r>
+          </w:p>
+        </w:tc>
+        <w:tc>
+          <w:tcPr>
+            <w:tcW w:type="dxa" w:w="3510"/>
+            <w:tcBorders>
+              <w:top w:val="single" w:color="C9CDD8" w:sz="4"/>
+              <w:left w:val="single" w:color="C9CDD8" w:sz="4"/>
+              <w:bottom w:val="single" w:color="C9CDD8" w:sz="4"/>
+              <w:right w:val="single" w:color="C9CDD8" w:sz="4"/>
+            </w:tcBorders>
+            <w:tcMar>
+              <w:top w:type="dxa" w:w="60"/>
+              <w:left w:type="dxa" w:w="100"/>
+              <w:bottom w:type="dxa" w:w="60"/>
+              <w:right w:type="dxa" w:w="100"/>
+            </w:tcMar>
+          </w:tcPr>
+          <w:p>
+            <w:pPr>
+              <w:spacing w:after="0"/>
+            </w:pPr>
+            <w:r>
+              <w:rPr>
+                <w:rFonts w:ascii="Calibri" w:cs="Calibri" w:eastAsia="Calibri" w:hAnsi="Calibri"/>
+                <w:sz w:val="19"/>
+                <w:szCs w:val="19"/>
+              </w:rPr>
+              <w:t xml:space="preserve">The Journeys dataset per journey per day, and its CSV.</w:t>
             </w:r>
           </w:p>
         </w:tc>

</xml_diff>